<commit_message>
Update all assets and curriculum to shifted timeline (Jun 22 – Jul 3)
Sync all dates across: candidate intro email, logistics email, pre-work
packet, competency domains overview, README, and all 10 day files.
Rename Build Track → AI-Native Build Track in remaining references.
Regenerate all 4 DOCX files. Log.md left as-is (historical record).

21 files updated.

Co-Authored-By: Claude Opus 4.6 (1M context) <noreply@anthropic.com>
</commit_message>
<xml_diff>
--- a/assets/candidate-intro-email-2026-06-04.docx
+++ b/assets/candidate-intro-email-2026-06-04.docx
@@ -11,29 +11,7 @@
           <w:b/>
           <w:sz w:val="56"/>
         </w:rPr>
-        <w:t>Anthropic Claude Deep Competency Program — Candidate Invitation</w:t>
-      </w:r>
-    </w:p>
-    <w:p>
-      <w:pPr>
-        <w:jc w:val="center"/>
-      </w:pPr>
-      <w:r>
-        <w:rPr>
-          <w:sz w:val="28"/>
-        </w:rPr>
-        <w:t>Vamsi Duvvuri</w:t>
-      </w:r>
-    </w:p>
-    <w:p>
-      <w:pPr>
-        <w:jc w:val="center"/>
-      </w:pPr>
-      <w:r>
-        <w:rPr>
-          <w:sz w:val="24"/>
-        </w:rPr>
-        <w:t>June 4, 2026</w:t>
+        <w:t>Candidate Intro Email 2026 06 04</w:t>
       </w:r>
     </w:p>
     <w:p>
@@ -66,7 +44,7 @@
         <w:rPr>
           <w:sz w:val="22"/>
         </w:rPr>
-        <w:t xml:space="preserve"> Invitation: Anthropic Claude Deep Competency Program (Jun 15-26) — Confirm by Mon Jun 9</w:t>
+        <w:t xml:space="preserve"> Invitation: Anthropic Claude Deep Competency Program (Jun 22 – Jul 3) — Confirm by Fri Jun 13</w:t>
       </w:r>
     </w:p>
     <w:p>
@@ -128,13 +106,26 @@
           <w:b/>
           <w:sz w:val="22"/>
         </w:rPr>
-        <w:t>Week 1 (Jun 15-19, in-person NYC):</w:t>
+        <w:t>Week 1 (Jun 22-26, in-person NYC):</w:t>
       </w:r>
       <w:r>
         <w:rPr>
           <w:sz w:val="22"/>
         </w:rPr>
-        <w:t xml:space="preserve"> Anthropic technology deep dive covering all five Claude Certified Architect exam domains — API, prompt engineering, tool design, Claude Code, agentic architecture, and more. Hands-on labs throughout.</w:t>
+        <w:t xml:space="preserve"> Anthropic technology deep dive covering all five Claude Certified Architect exam domains — API, prompt engineering, tool design, Claude Code, agentic architecture, and more. Hands-on labs throughout. (</w:t>
+      </w:r>
+      <w:r>
+        <w:rPr>
+          <w:b/>
+          <w:sz w:val="22"/>
+        </w:rPr>
+        <w:t>Certification-Readiness Track</w:t>
+      </w:r>
+      <w:r>
+        <w:rPr>
+          <w:sz w:val="22"/>
+        </w:rPr>
+        <w:t>)</w:t>
       </w:r>
     </w:p>
     <w:p>
@@ -151,13 +142,26 @@
           <w:b/>
           <w:sz w:val="22"/>
         </w:rPr>
-        <w:t>Week 2 (Jun 22-26, virtual):</w:t>
+        <w:t>Week 2 (Jun 29 – Jul 3, virtual):</w:t>
       </w:r>
       <w:r>
         <w:rPr>
           <w:sz w:val="22"/>
         </w:rPr>
-        <w:t xml:space="preserve"> AI Build Methodology — you'll work in cross-functional teams to build a real product from strategy through deployment using Claude, following a structured AI product process.</w:t>
+        <w:t xml:space="preserve"> You'll work in cross-functional teams to build a real product from strategy through deployment using Claude, following a structured AI product process. (</w:t>
+      </w:r>
+      <w:r>
+        <w:rPr>
+          <w:b/>
+          <w:sz w:val="22"/>
+        </w:rPr>
+        <w:t>AI-Native Build Track</w:t>
+      </w:r>
+      <w:r>
+        <w:rPr>
+          <w:sz w:val="22"/>
+        </w:rPr>
+        <w:t>)</w:t>
       </w:r>
     </w:p>
     <w:p>
@@ -190,13 +194,13 @@
           <w:b/>
           <w:sz w:val="22"/>
         </w:rPr>
-        <w:t>Claude Certified Architect credential</w:t>
+        <w:t>Certification readiness</w:t>
       </w:r>
       <w:r>
         <w:rPr>
           <w:sz w:val="22"/>
         </w:rPr>
-        <w:t xml:space="preserve"> — you'll be prepared to sit and pass the certification exam within 2 weeks of program completion (exam fee reimbursed upon passing)</w:t>
+        <w:t xml:space="preserve"> — you'll cover all five Claude Certified Architect exam domains and pass an internal competency assessment. Formal CCA exam timing will be coordinated with GCO and partner network counselors to ensure certifications count toward Anthropic partner tier eligibility.</w:t>
       </w:r>
     </w:p>
     <w:p>
@@ -294,7 +298,7 @@
         <w:rPr>
           <w:sz w:val="22"/>
         </w:rPr>
-        <w:t xml:space="preserve"> for the entire 2-week period (Jun 15-26). No client work, no splitting time. This is an all-in commitment.</w:t>
+        <w:t xml:space="preserve"> for the entire 2-week period (Jun 22 – Jul 3). No client work, no splitting time. This is an all-in commitment.</w:t>
       </w:r>
     </w:p>
     <w:p>
@@ -315,7 +319,7 @@
         <w:rPr>
           <w:sz w:val="22"/>
         </w:rPr>
-        <w:t xml:space="preserve"> for Week 1 (Jun 15-19) if you are not NYC-based. Travel and hotel will be arranged for you.</w:t>
+        <w:t xml:space="preserve"> for Week 1 (Jun 22-26) if you are not NYC-based. Travel and hotel will be arranged for you.</w:t>
       </w:r>
     </w:p>
     <w:p>
@@ -330,34 +334,13 @@
           <w:b/>
           <w:sz w:val="22"/>
         </w:rPr>
-        <w:t>Commitment to certify</w:t>
-      </w:r>
-      <w:r>
-        <w:rPr>
-          <w:sz w:val="22"/>
-        </w:rPr>
-        <w:t xml:space="preserve"> — you must schedule and complete the Claude Certified Architect exam by July 11, 2026.</w:t>
-      </w:r>
-    </w:p>
-    <w:p>
-      <w:r>
-        <w:rPr>
-          <w:sz w:val="22"/>
-        </w:rPr>
-        <w:t xml:space="preserve">4. </w:t>
-      </w:r>
-      <w:r>
-        <w:rPr>
-          <w:b/>
-          <w:sz w:val="22"/>
-        </w:rPr>
         <w:t>Pre-work</w:t>
       </w:r>
       <w:r>
         <w:rPr>
           <w:sz w:val="22"/>
         </w:rPr>
-        <w:t xml:space="preserve"> — you'll receive a setup packet next week (Claude account, Claude Code install, pre-reading). Please complete it before Jun 15.</w:t>
+        <w:t xml:space="preserve"> — you'll receive a setup packet the week of Jun 16 (Claude account, Claude Code install, pre-reading). Please complete it before Jun 22.</w:t>
       </w:r>
     </w:p>
     <w:p>
@@ -461,7 +444,7 @@
           <w:b/>
           <w:sz w:val="22"/>
         </w:rPr>
-        <w:t>Please confirm your interest and availability by Monday, June 9.</w:t>
+        <w:t>Please confirm your interest and availability by Friday, June 13.</w:t>
       </w:r>
       <w:r>
         <w:rPr>
@@ -488,7 +471,7 @@
         <w:rPr>
           <w:sz w:val="22"/>
         </w:rPr>
-        <w:t xml:space="preserve"> — can you commit full-time Jun 15-26?</w:t>
+        <w:t xml:space="preserve"> — can you commit full-time Jun 22 – Jul 3?</w:t>
       </w:r>
     </w:p>
     <w:p>

</xml_diff>